<commit_message>
M3 complete: clean-rebuild evidence, M3 engineering document, plan status
docs/evidence/m3/06-clean-rebuild.txt: make down && make up && make
gpu-check && make gitops exits 0 on a brand-new cluster; every
NetworkPolicy and ClusterPolicy is created before the first palisade
pod, and a real request is answered. ADR 0020 marked verified.

documentation/M3-Kubernetes-GitOps-Policy.docx (built from
_build/m3.py): what was built, the five defects only a real sync
exposed, the signature-verification investigation, deviations, tool
choices, limitations, glossary. Plan headings updated: M0-M3 complete,
M4 next.

Co-Authored-By: Claude Opus 5.5 <noreply@anthropic.com>
</commit_message>
<xml_diff>
--- a/documentation/Palisade - Project Plan.docx
+++ b/documentation/Palisade - Project Plan.docx
@@ -6070,7 +6070,7 @@
         <w:pStyle w:val="Heading2"/>
       </w:pPr>
       <w:r>
-        <w:t>M1 - The inference service   (NEXT)</w:t>
+        <w:t>M1 - The inference service   (COMPLETE)</w:t>
       </w:r>
     </w:p>
     <w:p>
@@ -6333,7 +6333,7 @@
         <w:pStyle w:val="Heading2"/>
       </w:pPr>
       <w:r>
-        <w:t>M2 - Supply chain and CI/CD</w:t>
+        <w:t>M2 - Supply chain and CI/CD   (COMPLETE)</w:t>
       </w:r>
     </w:p>
     <w:p>
@@ -6646,7 +6646,7 @@
         <w:pStyle w:val="Heading2"/>
       </w:pPr>
       <w:r>
-        <w:t>M3 - Kubernetes, GitOps and policy</w:t>
+        <w:t>M3 - Kubernetes, GitOps and policy   (COMPLETE)</w:t>
       </w:r>
     </w:p>
     <w:p>
@@ -6893,7 +6893,7 @@
         <w:pStyle w:val="Heading2"/>
       </w:pPr>
       <w:r>
-        <w:t>M4 - Platform features and observability</w:t>
+        <w:t>M4 - Platform features and observability   (NEXT)</w:t>
       </w:r>
     </w:p>
     <w:p>

</xml_diff>